<commit_message>
Update resume PDF and DOCX with JTOV Network project
</commit_message>
<xml_diff>
--- a/Efe_Obukohwo_Resume.docx
+++ b/Efe_Obukohwo_Resume.docx
@@ -1004,31 +1004,31 @@
           <w:szCs w:val="22"/>
           <w:rFonts w:ascii="Times New Roman" w:cs="Times New Roman" w:eastAsia="Times New Roman" w:hAnsi="Times New Roman"/>
         </w:rPr>
-        <w:t xml:space="preserve">TekVwarho ProAudit</w:t>
-      </w:r>
-      <w:r>
-        <w:rPr>
-          <w:i/>
-          <w:iCs/>
-          <w:sz w:val="20"/>
-          <w:szCs w:val="20"/>
-          <w:rFonts w:ascii="Times New Roman" w:cs="Times New Roman" w:eastAsia="Times New Roman" w:hAnsi="Times New Roman"/>
-        </w:rPr>
-        <w:t xml:space="preserve"> (Oct 2025 – Present)</w:t>
-      </w:r>
-    </w:p>
-    <w:p>
-      <w:pPr>
-        <w:spacing w:after="50"/>
-        <w:ind w:left="360"/>
-      </w:pPr>
-      <w:r>
-        <w:rPr>
-          <w:sz w:val="20"/>
-          <w:szCs w:val="20"/>
-          <w:rFonts w:ascii="Times New Roman" w:cs="Times New Roman" w:eastAsia="Times New Roman" w:hAnsi="Times New Roman"/>
-        </w:rPr>
-        <w:t xml:space="preserve">• Enterprise-grade Nigerian tax compliance and forensic audit platform with 2026 tax reform support, featuring Benford's Law fraud detection, hash-chain immutable ledger, and NDPA 2023 security compliance</w:t>
+        <w:t xml:space="preserve">JTOV Network</w:t>
+      </w:r>
+      <w:r>
+        <w:rPr>
+          <w:i/>
+          <w:iCs/>
+          <w:sz w:val="20"/>
+          <w:szCs w:val="20"/>
+          <w:rFonts w:ascii="Times New Roman" w:cs="Times New Roman" w:eastAsia="Times New Roman" w:hAnsi="Times New Roman"/>
+        </w:rPr>
+        <w:t xml:space="preserve"> (Jan 2026 – Present)</w:t>
+      </w:r>
+    </w:p>
+    <w:p>
+      <w:pPr>
+        <w:spacing w:after="50"/>
+        <w:ind w:left="360"/>
+      </w:pPr>
+      <w:r>
+        <w:rPr>
+          <w:sz w:val="20"/>
+          <w:szCs w:val="20"/>
+          <w:rFonts w:ascii="Times New Roman" w:cs="Times New Roman" w:eastAsia="Times New Roman" w:hAnsi="Times New Roman"/>
+        </w:rPr>
+        <w:t xml:space="preserve">• AI-powered mentorship platform with intelligent matching, WebRTC video calling, gamification, career roadmaps, and a complete video learning system</w:t>
       </w:r>
     </w:p>
     <w:p>
@@ -1043,7 +1043,7 @@
           <w:szCs w:val="18"/>
           <w:rFonts w:ascii="Times New Roman" w:cs="Times New Roman" w:eastAsia="Times New Roman" w:hAnsi="Times New Roman"/>
         </w:rPr>
-        <w:t xml:space="preserve">  Live: https://ingenious-emotion-production-c3c3.up.railway.app/ | GitHub: https://github.com/EfeObus/TekVwarho-ProAudit</w:t>
+        <w:t xml:space="preserve">  GitHub: https://github.com/EfeObus/JTOV-Network</w:t>
       </w:r>
     </w:p>
     <w:p>
@@ -1059,7 +1059,7 @@
           <w:szCs w:val="18"/>
           <w:rFonts w:ascii="Times New Roman" w:cs="Times New Roman" w:eastAsia="Times New Roman" w:hAnsi="Times New Roman"/>
         </w:rPr>
-        <w:t xml:space="preserve">  Technologies: Python, FastAPI, PostgreSQL, SQLAlchemy, Alembic, HTMX</w:t>
+        <w:t xml:space="preserve">  Technologies: React, TypeScript, Node.js, Express.js, PostgreSQL, Drizzle ORM</w:t>
       </w:r>
     </w:p>
     <w:p>
@@ -1074,31 +1074,31 @@
           <w:szCs w:val="22"/>
           <w:rFonts w:ascii="Times New Roman" w:cs="Times New Roman" w:eastAsia="Times New Roman" w:hAnsi="Times New Roman"/>
         </w:rPr>
-        <w:t xml:space="preserve">WonderWorld Learning Adventure</w:t>
-      </w:r>
-      <w:r>
-        <w:rPr>
-          <w:i/>
-          <w:iCs/>
-          <w:sz w:val="20"/>
-          <w:szCs w:val="20"/>
-          <w:rFonts w:ascii="Times New Roman" w:cs="Times New Roman" w:eastAsia="Times New Roman" w:hAnsi="Times New Roman"/>
-        </w:rPr>
-        <w:t xml:space="preserve"> (Dec 2025 – Present)</w:t>
-      </w:r>
-    </w:p>
-    <w:p>
-      <w:pPr>
-        <w:spacing w:after="50"/>
-        <w:ind w:left="360"/>
-      </w:pPr>
-      <w:r>
-        <w:rPr>
-          <w:sz w:val="20"/>
-          <w:szCs w:val="20"/>
-          <w:rFonts w:ascii="Times New Roman" w:cs="Times New Roman" w:eastAsia="Times New Roman" w:hAnsi="Times New Roman"/>
-        </w:rPr>
-        <w:t xml:space="preserve">• Adaptive early-childhood learning platform (ages 2-8) using Item Response Theory for personalization, with offline speech recognition and COPPA/GDPR-K compliance</w:t>
+        <w:t xml:space="preserve">TekVwarho ProAudit</w:t>
+      </w:r>
+      <w:r>
+        <w:rPr>
+          <w:i/>
+          <w:iCs/>
+          <w:sz w:val="20"/>
+          <w:szCs w:val="20"/>
+          <w:rFonts w:ascii="Times New Roman" w:cs="Times New Roman" w:eastAsia="Times New Roman" w:hAnsi="Times New Roman"/>
+        </w:rPr>
+        <w:t xml:space="preserve"> (Oct 2025 – Present)</w:t>
+      </w:r>
+    </w:p>
+    <w:p>
+      <w:pPr>
+        <w:spacing w:after="50"/>
+        <w:ind w:left="360"/>
+      </w:pPr>
+      <w:r>
+        <w:rPr>
+          <w:sz w:val="20"/>
+          <w:szCs w:val="20"/>
+          <w:rFonts w:ascii="Times New Roman" w:cs="Times New Roman" w:eastAsia="Times New Roman" w:hAnsi="Times New Roman"/>
+        </w:rPr>
+        <w:t xml:space="preserve">• Enterprise-grade Nigerian tax compliance and forensic audit platform with 2026 tax reform support, featuring Benford's Law fraud detection, hash-chain immutable ledger, and NDPA 2023 security compliance</w:t>
       </w:r>
     </w:p>
     <w:p>
@@ -1113,7 +1113,7 @@
           <w:szCs w:val="18"/>
           <w:rFonts w:ascii="Times New Roman" w:cs="Times New Roman" w:eastAsia="Times New Roman" w:hAnsi="Times New Roman"/>
         </w:rPr>
-        <w:t xml:space="preserve">  GitHub: https://github.com/EfeObus/WonderWorld-Learning-Adventure</w:t>
+        <w:t xml:space="preserve">  Live: https://ingenious-emotion-production-c3c3.up.railway.app/ | GitHub: https://github.com/EfeObus/TekVwarho-ProAudit</w:t>
       </w:r>
     </w:p>
     <w:p>
@@ -1129,7 +1129,7 @@
           <w:szCs w:val="18"/>
           <w:rFonts w:ascii="Times New Roman" w:cs="Times New Roman" w:eastAsia="Times New Roman" w:hAnsi="Times New Roman"/>
         </w:rPr>
-        <w:t xml:space="preserve">  Technologies: Flutter, Dart, Flame Engine, Python, FastAPI, PostgreSQL</w:t>
+        <w:t xml:space="preserve">  Technologies: Python, FastAPI, PostgreSQL, SQLAlchemy, Alembic, HTMX</w:t>
       </w:r>
     </w:p>
     <w:p>
@@ -1144,7 +1144,7 @@
           <w:szCs w:val="22"/>
           <w:rFonts w:ascii="Times New Roman" w:cs="Times New Roman" w:eastAsia="Times New Roman" w:hAnsi="Times New Roman"/>
         </w:rPr>
-        <w:t xml:space="preserve">TekVwa Life</w:t>
+        <w:t xml:space="preserve">WonderWorld Learning Adventure</w:t>
       </w:r>
       <w:r>
         <w:rPr>
@@ -1168,7 +1168,7 @@
           <w:szCs w:val="20"/>
           <w:rFonts w:ascii="Times New Roman" w:cs="Times New Roman" w:eastAsia="Times New Roman" w:hAnsi="Times New Roman"/>
         </w:rPr>
-        <w:t xml:space="preserve">• Digital autobiography and legacy-preservation platform with 28-chapter framework, enterprise security, and professional document export</w:t>
+        <w:t xml:space="preserve">• Adaptive early-childhood learning platform (ages 2-8) using Item Response Theory for personalization, with offline speech recognition and COPPA/GDPR-K compliance</w:t>
       </w:r>
     </w:p>
     <w:p>
@@ -1183,7 +1183,7 @@
           <w:szCs w:val="18"/>
           <w:rFonts w:ascii="Times New Roman" w:cs="Times New Roman" w:eastAsia="Times New Roman" w:hAnsi="Times New Roman"/>
         </w:rPr>
-        <w:t xml:space="preserve">  Live: https://tekvwa-life-production.up.railway.app/ | GitHub: https://github.com/EfeObus/TekVwa-Life</w:t>
+        <w:t xml:space="preserve">  GitHub: https://github.com/EfeObus/WonderWorld-Learning-Adventure</w:t>
       </w:r>
     </w:p>
     <w:p>
@@ -1199,7 +1199,7 @@
           <w:szCs w:val="18"/>
           <w:rFonts w:ascii="Times New Roman" w:cs="Times New Roman" w:eastAsia="Times New Roman" w:hAnsi="Times New Roman"/>
         </w:rPr>
-        <w:t xml:space="preserve">  Technologies: Node.js, Express.js, PostgreSQL (AWS RDS), Prisma ORM, React, Material UI</w:t>
+        <w:t xml:space="preserve">  Technologies: Flutter, Dart, Flame Engine, Python, FastAPI, PostgreSQL</w:t>
       </w:r>
     </w:p>
     <w:p>
@@ -1214,31 +1214,31 @@
           <w:szCs w:val="22"/>
           <w:rFonts w:ascii="Times New Roman" w:cs="Times New Roman" w:eastAsia="Times New Roman" w:hAnsi="Times New Roman"/>
         </w:rPr>
-        <w:t xml:space="preserve">TekVwarho Analysis Platform</w:t>
-      </w:r>
-      <w:r>
-        <w:rPr>
-          <w:i/>
-          <w:iCs/>
-          <w:sz w:val="20"/>
-          <w:szCs w:val="20"/>
-          <w:rFonts w:ascii="Times New Roman" w:cs="Times New Roman" w:eastAsia="Times New Roman" w:hAnsi="Times New Roman"/>
-        </w:rPr>
-        <w:t xml:space="preserve"> (Jan 2025 – Present)</w:t>
-      </w:r>
-    </w:p>
-    <w:p>
-      <w:pPr>
-        <w:spacing w:after="50"/>
-        <w:ind w:left="360"/>
-      </w:pPr>
-      <w:r>
-        <w:rPr>
-          <w:sz w:val="20"/>
-          <w:szCs w:val="20"/>
-          <w:rFonts w:ascii="Times New Roman" w:cs="Times New Roman" w:eastAsia="Times New Roman" w:hAnsi="Times New Roman"/>
-        </w:rPr>
-        <w:t xml:space="preserve">• No-code analytics platform with 15+ analysis types, automated ML model training, and AI-powered insights for non-programmers</w:t>
+        <w:t xml:space="preserve">TekVwa Life</w:t>
+      </w:r>
+      <w:r>
+        <w:rPr>
+          <w:i/>
+          <w:iCs/>
+          <w:sz w:val="20"/>
+          <w:szCs w:val="20"/>
+          <w:rFonts w:ascii="Times New Roman" w:cs="Times New Roman" w:eastAsia="Times New Roman" w:hAnsi="Times New Roman"/>
+        </w:rPr>
+        <w:t xml:space="preserve"> (Dec 2025 – Present)</w:t>
+      </w:r>
+    </w:p>
+    <w:p>
+      <w:pPr>
+        <w:spacing w:after="50"/>
+        <w:ind w:left="360"/>
+      </w:pPr>
+      <w:r>
+        <w:rPr>
+          <w:sz w:val="20"/>
+          <w:szCs w:val="20"/>
+          <w:rFonts w:ascii="Times New Roman" w:cs="Times New Roman" w:eastAsia="Times New Roman" w:hAnsi="Times New Roman"/>
+        </w:rPr>
+        <w:t xml:space="preserve">• Digital autobiography and legacy-preservation platform with 28-chapter framework, enterprise security, and professional document export</w:t>
       </w:r>
     </w:p>
     <w:p>
@@ -1253,7 +1253,7 @@
           <w:szCs w:val="18"/>
           <w:rFonts w:ascii="Times New Roman" w:cs="Times New Roman" w:eastAsia="Times New Roman" w:hAnsi="Times New Roman"/>
         </w:rPr>
-        <w:t xml:space="preserve">  GitHub: https://github.com/EfeObus/TekVwarho-Analysis</w:t>
+        <w:t xml:space="preserve">  Live: https://tekvwa-life-production.up.railway.app/ | GitHub: https://github.com/EfeObus/TekVwa-Life</w:t>
       </w:r>
     </w:p>
     <w:p>
@@ -1269,7 +1269,7 @@
           <w:szCs w:val="18"/>
           <w:rFonts w:ascii="Times New Roman" w:cs="Times New Roman" w:eastAsia="Times New Roman" w:hAnsi="Times New Roman"/>
         </w:rPr>
-        <w:t xml:space="preserve">  Technologies: Flask, PostgreSQL, OpenAI API, AutoML, Tableau, Python</w:t>
+        <w:t xml:space="preserve">  Technologies: Node.js, Express.js, PostgreSQL (AWS RDS), Prisma ORM, React, Material UI</w:t>
       </w:r>
     </w:p>
     <w:p>
@@ -1284,31 +1284,31 @@
           <w:szCs w:val="22"/>
           <w:rFonts w:ascii="Times New Roman" w:cs="Times New Roman" w:eastAsia="Times New Roman" w:hAnsi="Times New Roman"/>
         </w:rPr>
-        <w:t xml:space="preserve">TK Reports - AI-Powered Data Analysis</w:t>
-      </w:r>
-      <w:r>
-        <w:rPr>
-          <w:i/>
-          <w:iCs/>
-          <w:sz w:val="20"/>
-          <w:szCs w:val="20"/>
-          <w:rFonts w:ascii="Times New Roman" w:cs="Times New Roman" w:eastAsia="Times New Roman" w:hAnsi="Times New Roman"/>
-        </w:rPr>
-        <w:t xml:space="preserve"> (Oct 2024)</w:t>
-      </w:r>
-    </w:p>
-    <w:p>
-      <w:pPr>
-        <w:spacing w:after="50"/>
-        <w:ind w:left="360"/>
-      </w:pPr>
-      <w:r>
-        <w:rPr>
-          <w:sz w:val="20"/>
-          <w:szCs w:val="20"/>
-          <w:rFonts w:ascii="Times New Roman" w:cs="Times New Roman" w:eastAsia="Times New Roman" w:hAnsi="Times New Roman"/>
-        </w:rPr>
-        <w:t xml:space="preserve">• AI-powered analytics platform using GPT-4 to transform datasets into 15+ page executive reports with statistical analysis and visualizations</w:t>
+        <w:t xml:space="preserve">TekVwarho Analysis Platform</w:t>
+      </w:r>
+      <w:r>
+        <w:rPr>
+          <w:i/>
+          <w:iCs/>
+          <w:sz w:val="20"/>
+          <w:szCs w:val="20"/>
+          <w:rFonts w:ascii="Times New Roman" w:cs="Times New Roman" w:eastAsia="Times New Roman" w:hAnsi="Times New Roman"/>
+        </w:rPr>
+        <w:t xml:space="preserve"> (Jan 2025 – Present)</w:t>
+      </w:r>
+    </w:p>
+    <w:p>
+      <w:pPr>
+        <w:spacing w:after="50"/>
+        <w:ind w:left="360"/>
+      </w:pPr>
+      <w:r>
+        <w:rPr>
+          <w:sz w:val="20"/>
+          <w:szCs w:val="20"/>
+          <w:rFonts w:ascii="Times New Roman" w:cs="Times New Roman" w:eastAsia="Times New Roman" w:hAnsi="Times New Roman"/>
+        </w:rPr>
+        <w:t xml:space="preserve">• No-code analytics platform with 15+ analysis types, automated ML model training, and AI-powered insights for non-programmers</w:t>
       </w:r>
     </w:p>
     <w:p>
@@ -1323,7 +1323,7 @@
           <w:szCs w:val="18"/>
           <w:rFonts w:ascii="Times New Roman" w:cs="Times New Roman" w:eastAsia="Times New Roman" w:hAnsi="Times New Roman"/>
         </w:rPr>
-        <w:t xml:space="preserve">  GitHub: https://github.com/EfeObus/TK-Reports</w:t>
+        <w:t xml:space="preserve">  GitHub: https://github.com/EfeObus/TekVwarho-Analysis</w:t>
       </w:r>
     </w:p>
     <w:p>
@@ -1339,7 +1339,7 @@
           <w:szCs w:val="18"/>
           <w:rFonts w:ascii="Times New Roman" w:cs="Times New Roman" w:eastAsia="Times New Roman" w:hAnsi="Times New Roman"/>
         </w:rPr>
-        <w:t xml:space="preserve">  Technologies: Python, Flask, OpenAI GPT-4, Pandas, NumPy, SciPy</w:t>
+        <w:t xml:space="preserve">  Technologies: Flask, PostgreSQL, OpenAI API, AutoML, Tableau, Python</w:t>
       </w:r>
     </w:p>
     <w:p>
@@ -1354,31 +1354,31 @@
           <w:szCs w:val="22"/>
           <w:rFonts w:ascii="Times New Roman" w:cs="Times New Roman" w:eastAsia="Times New Roman" w:hAnsi="Times New Roman"/>
         </w:rPr>
-        <w:t xml:space="preserve">Zodiac Real Estate AI</w:t>
-      </w:r>
-      <w:r>
-        <w:rPr>
-          <w:i/>
-          <w:iCs/>
-          <w:sz w:val="20"/>
-          <w:szCs w:val="20"/>
-          <w:rFonts w:ascii="Times New Roman" w:cs="Times New Roman" w:eastAsia="Times New Roman" w:hAnsi="Times New Roman"/>
-        </w:rPr>
-        <w:t xml:space="preserve"> (May 2025 – Aug 2025)</w:t>
-      </w:r>
-    </w:p>
-    <w:p>
-      <w:pPr>
-        <w:spacing w:after="50"/>
-        <w:ind w:left="360"/>
-      </w:pPr>
-      <w:r>
-        <w:rPr>
-          <w:sz w:val="20"/>
-          <w:szCs w:val="20"/>
-          <w:rFonts w:ascii="Times New Roman" w:cs="Times New Roman" w:eastAsia="Times New Roman" w:hAnsi="Times New Roman"/>
-        </w:rPr>
-        <w:t xml:space="preserve">• Real estate analytics platform with 88.3% ML accuracy processing 49,551+ Canadian properties with real-time economic data integration</w:t>
+        <w:t xml:space="preserve">TK Reports - AI-Powered Data Analysis</w:t>
+      </w:r>
+      <w:r>
+        <w:rPr>
+          <w:i/>
+          <w:iCs/>
+          <w:sz w:val="20"/>
+          <w:szCs w:val="20"/>
+          <w:rFonts w:ascii="Times New Roman" w:cs="Times New Roman" w:eastAsia="Times New Roman" w:hAnsi="Times New Roman"/>
+        </w:rPr>
+        <w:t xml:space="preserve"> (Oct 2024)</w:t>
+      </w:r>
+    </w:p>
+    <w:p>
+      <w:pPr>
+        <w:spacing w:after="50"/>
+        <w:ind w:left="360"/>
+      </w:pPr>
+      <w:r>
+        <w:rPr>
+          <w:sz w:val="20"/>
+          <w:szCs w:val="20"/>
+          <w:rFonts w:ascii="Times New Roman" w:cs="Times New Roman" w:eastAsia="Times New Roman" w:hAnsi="Times New Roman"/>
+        </w:rPr>
+        <w:t xml:space="preserve">• AI-powered analytics platform using GPT-4 to transform datasets into 15+ page executive reports with statistical analysis and visualizations</w:t>
       </w:r>
     </w:p>
     <w:p>
@@ -1393,7 +1393,7 @@
           <w:szCs w:val="18"/>
           <w:rFonts w:ascii="Times New Roman" w:cs="Times New Roman" w:eastAsia="Times New Roman" w:hAnsi="Times New Roman"/>
         </w:rPr>
-        <w:t xml:space="preserve">  GitHub: https://github.com/EfeObus/NextProperty</w:t>
+        <w:t xml:space="preserve">  GitHub: https://github.com/EfeObus/TK-Reports</w:t>
       </w:r>
     </w:p>
     <w:p>
@@ -1409,7 +1409,7 @@
           <w:szCs w:val="18"/>
           <w:rFonts w:ascii="Times New Roman" w:cs="Times New Roman" w:eastAsia="Times New Roman" w:hAnsi="Times New Roman"/>
         </w:rPr>
-        <w:t xml:space="preserve">  Technologies: Python, Flask, MySQL, Scikit-learn, XGBoost, Docker</w:t>
+        <w:t xml:space="preserve">  Technologies: Python, Flask, OpenAI GPT-4, Pandas, NumPy, SciPy</w:t>
       </w:r>
     </w:p>
     <w:p>

</xml_diff>